<commit_message>
Checkpoint: uncommitted D6 work + export-pipeline guardrail + Step 0
Captures the working-tree state at the start of the DOCX/ODT export
consolidation effort so subsequent steps are reviewable commits.

Pre-existing uncommitted work (not from this effort):
- sw_merge_helpers.resize_images (shared image-size capping, D6)
- sw_export_merge._write_docx hyperlink-rel remapping
- README.md / manifest.json / styles.css / templates/book.docx edits

Step 0 (this effort):
- Delete dead DocumentCompiler.postprocess_odt (235 lines, no callers):
  a string-replacement reimplementation of the ODT merge.
- Delete scripts/*.bk.py stale backups (were bundled into main.js).
- Unify 3 pandoc-style-remap tables into sw_merge_helpers.STYLE_REMAP.

Co-Authored-By: Claude Sonnet 5 <noreply@anthropic.com>
</commit_message>
<xml_diff>
--- a/templates/book.docx
+++ b/templates/book.docx
@@ -308,23 +308,7 @@
             <w:noProof/>
             <w:lang w:val="en-CA"/>
           </w:rPr>
-          <w:t>Introduc</w:t>
-        </w:r>
-        <w:r>
-          <w:rPr>
-            <w:rStyle w:val="Hyperlink"/>
-            <w:noProof/>
-            <w:lang w:val="en-CA"/>
-          </w:rPr>
-          <w:t>t</w:t>
-        </w:r>
-        <w:r>
-          <w:rPr>
-            <w:rStyle w:val="Hyperlink"/>
-            <w:noProof/>
-            <w:lang w:val="en-CA"/>
-          </w:rPr>
-          <w:t>ion</w:t>
+          <w:t>Introduction</w:t>
         </w:r>
         <w:r>
           <w:rPr>
@@ -1063,1076 +1047,6 @@
     <w:p>
       <w:pPr>
         <w:pStyle w:val="BodyText"/>
-        <w:rPr>
-          <w:lang w:val="fr-FR"/>
-        </w:rPr>
-      </w:pPr>
-      <w:r>
-        <w:rPr>
-          <w:lang w:val="en-CA"/>
-        </w:rPr>
-        <w:t xml:space="preserve">Lorem ipsum dolor </w:t>
-      </w:r>
-      <w:proofErr w:type="gramStart"/>
-      <w:r>
-        <w:rPr>
-          <w:lang w:val="en-CA"/>
-        </w:rPr>
-        <w:t>sit</w:t>
-      </w:r>
-      <w:proofErr w:type="gramEnd"/>
-      <w:r>
-        <w:rPr>
-          <w:lang w:val="en-CA"/>
-        </w:rPr>
-        <w:t xml:space="preserve"> </w:t>
-      </w:r>
-      <w:proofErr w:type="spellStart"/>
-      <w:r>
-        <w:rPr>
-          <w:lang w:val="en-CA"/>
-        </w:rPr>
-        <w:t>amet</w:t>
-      </w:r>
-      <w:proofErr w:type="spellEnd"/>
-      <w:r>
-        <w:rPr>
-          <w:lang w:val="en-CA"/>
-        </w:rPr>
-        <w:t xml:space="preserve">, </w:t>
-      </w:r>
-      <w:proofErr w:type="spellStart"/>
-      <w:r>
-        <w:rPr>
-          <w:lang w:val="en-CA"/>
-        </w:rPr>
-        <w:t>consectetur</w:t>
-      </w:r>
-      <w:proofErr w:type="spellEnd"/>
-      <w:r>
-        <w:rPr>
-          <w:lang w:val="en-CA"/>
-        </w:rPr>
-        <w:t xml:space="preserve"> </w:t>
-      </w:r>
-      <w:proofErr w:type="spellStart"/>
-      <w:r>
-        <w:rPr>
-          <w:lang w:val="en-CA"/>
-        </w:rPr>
-        <w:t>adipiscing</w:t>
-      </w:r>
-      <w:proofErr w:type="spellEnd"/>
-      <w:r>
-        <w:rPr>
-          <w:lang w:val="en-CA"/>
-        </w:rPr>
-        <w:t xml:space="preserve"> </w:t>
-      </w:r>
-      <w:proofErr w:type="spellStart"/>
-      <w:r>
-        <w:rPr>
-          <w:lang w:val="en-CA"/>
-        </w:rPr>
-        <w:t>elit</w:t>
-      </w:r>
-      <w:proofErr w:type="spellEnd"/>
-      <w:r>
-        <w:rPr>
-          <w:lang w:val="en-CA"/>
-        </w:rPr>
-        <w:t xml:space="preserve">. </w:t>
-      </w:r>
-      <w:proofErr w:type="spellStart"/>
-      <w:r>
-        <w:rPr>
-          <w:lang w:val="en-CA"/>
-        </w:rPr>
-        <w:t>Phasellus</w:t>
-      </w:r>
-      <w:proofErr w:type="spellEnd"/>
-      <w:r>
-        <w:rPr>
-          <w:lang w:val="en-CA"/>
-        </w:rPr>
-        <w:t xml:space="preserve"> </w:t>
-      </w:r>
-      <w:proofErr w:type="spellStart"/>
-      <w:r>
-        <w:rPr>
-          <w:lang w:val="en-CA"/>
-        </w:rPr>
-        <w:t>eget</w:t>
-      </w:r>
-      <w:proofErr w:type="spellEnd"/>
-      <w:r>
-        <w:rPr>
-          <w:lang w:val="en-CA"/>
-        </w:rPr>
-        <w:t xml:space="preserve"> </w:t>
-      </w:r>
-      <w:proofErr w:type="spellStart"/>
-      <w:r>
-        <w:rPr>
-          <w:lang w:val="en-CA"/>
-        </w:rPr>
-        <w:t>turpis</w:t>
-      </w:r>
-      <w:proofErr w:type="spellEnd"/>
-      <w:r>
-        <w:rPr>
-          <w:lang w:val="en-CA"/>
-        </w:rPr>
-        <w:t xml:space="preserve"> nec </w:t>
-      </w:r>
-      <w:proofErr w:type="spellStart"/>
-      <w:r>
-        <w:rPr>
-          <w:lang w:val="en-CA"/>
-        </w:rPr>
-        <w:t>risus</w:t>
-      </w:r>
-      <w:proofErr w:type="spellEnd"/>
-      <w:r>
-        <w:rPr>
-          <w:lang w:val="en-CA"/>
-        </w:rPr>
-        <w:t xml:space="preserve"> </w:t>
-      </w:r>
-      <w:proofErr w:type="spellStart"/>
-      <w:r>
-        <w:rPr>
-          <w:lang w:val="en-CA"/>
-        </w:rPr>
-        <w:t>ultricies</w:t>
-      </w:r>
-      <w:proofErr w:type="spellEnd"/>
-      <w:r>
-        <w:rPr>
-          <w:lang w:val="en-CA"/>
-        </w:rPr>
-        <w:t xml:space="preserve"> </w:t>
-      </w:r>
-      <w:proofErr w:type="spellStart"/>
-      <w:r>
-        <w:rPr>
-          <w:lang w:val="en-CA"/>
-        </w:rPr>
-        <w:t>fringilla</w:t>
-      </w:r>
-      <w:proofErr w:type="spellEnd"/>
-      <w:r>
-        <w:rPr>
-          <w:lang w:val="en-CA"/>
-        </w:rPr>
-        <w:t xml:space="preserve"> ac in </w:t>
-      </w:r>
-      <w:proofErr w:type="spellStart"/>
-      <w:r>
-        <w:rPr>
-          <w:lang w:val="en-CA"/>
-        </w:rPr>
-        <w:t>arcu</w:t>
-      </w:r>
-      <w:proofErr w:type="spellEnd"/>
-      <w:r>
-        <w:rPr>
-          <w:lang w:val="en-CA"/>
-        </w:rPr>
-        <w:t xml:space="preserve">. </w:t>
-      </w:r>
-      <w:proofErr w:type="spellStart"/>
-      <w:r>
-        <w:rPr>
-          <w:lang w:val="fr-FR"/>
-        </w:rPr>
-        <w:t>Vivamus</w:t>
-      </w:r>
-      <w:proofErr w:type="spellEnd"/>
-      <w:r>
-        <w:rPr>
-          <w:lang w:val="fr-FR"/>
-        </w:rPr>
-        <w:t xml:space="preserve"> </w:t>
-      </w:r>
-      <w:proofErr w:type="spellStart"/>
-      <w:r>
-        <w:rPr>
-          <w:lang w:val="fr-FR"/>
-        </w:rPr>
-        <w:t>faucibus</w:t>
-      </w:r>
-      <w:proofErr w:type="spellEnd"/>
-      <w:r>
-        <w:rPr>
-          <w:lang w:val="fr-FR"/>
-        </w:rPr>
-        <w:t xml:space="preserve"> </w:t>
-      </w:r>
-      <w:proofErr w:type="spellStart"/>
-      <w:r>
-        <w:rPr>
-          <w:lang w:val="fr-FR"/>
-        </w:rPr>
-        <w:t>venenatis</w:t>
-      </w:r>
-      <w:proofErr w:type="spellEnd"/>
-      <w:r>
-        <w:rPr>
-          <w:lang w:val="fr-FR"/>
-        </w:rPr>
-        <w:t xml:space="preserve"> </w:t>
-      </w:r>
-      <w:proofErr w:type="spellStart"/>
-      <w:r>
-        <w:rPr>
-          <w:lang w:val="fr-FR"/>
-        </w:rPr>
-        <w:t>nisi</w:t>
-      </w:r>
-      <w:proofErr w:type="spellEnd"/>
-      <w:r>
-        <w:rPr>
-          <w:lang w:val="fr-FR"/>
-        </w:rPr>
-        <w:t xml:space="preserve"> </w:t>
-      </w:r>
-      <w:proofErr w:type="spellStart"/>
-      <w:r>
-        <w:rPr>
-          <w:lang w:val="fr-FR"/>
-        </w:rPr>
-        <w:t>eget</w:t>
-      </w:r>
-      <w:proofErr w:type="spellEnd"/>
-      <w:r>
-        <w:rPr>
-          <w:lang w:val="fr-FR"/>
-        </w:rPr>
-        <w:t xml:space="preserve"> </w:t>
-      </w:r>
-      <w:proofErr w:type="spellStart"/>
-      <w:r>
-        <w:rPr>
-          <w:lang w:val="fr-FR"/>
-        </w:rPr>
-        <w:t>vestibulum</w:t>
-      </w:r>
-      <w:proofErr w:type="spellEnd"/>
-      <w:r>
-        <w:rPr>
-          <w:lang w:val="fr-FR"/>
-        </w:rPr>
-        <w:t xml:space="preserve">. Integer nec est </w:t>
-      </w:r>
-      <w:proofErr w:type="spellStart"/>
-      <w:r>
-        <w:rPr>
-          <w:lang w:val="fr-FR"/>
-        </w:rPr>
-        <w:t>quis</w:t>
-      </w:r>
-      <w:proofErr w:type="spellEnd"/>
-      <w:r>
-        <w:rPr>
-          <w:lang w:val="fr-FR"/>
-        </w:rPr>
-        <w:t xml:space="preserve"> </w:t>
-      </w:r>
-      <w:proofErr w:type="spellStart"/>
-      <w:r>
-        <w:rPr>
-          <w:lang w:val="fr-FR"/>
-        </w:rPr>
-        <w:t>metus</w:t>
-      </w:r>
-      <w:proofErr w:type="spellEnd"/>
-      <w:r>
-        <w:rPr>
-          <w:lang w:val="fr-FR"/>
-        </w:rPr>
-        <w:t xml:space="preserve"> </w:t>
-      </w:r>
-      <w:proofErr w:type="spellStart"/>
-      <w:r>
-        <w:rPr>
-          <w:lang w:val="fr-FR"/>
-        </w:rPr>
-        <w:t>vulputate</w:t>
-      </w:r>
-      <w:proofErr w:type="spellEnd"/>
-      <w:r>
-        <w:rPr>
-          <w:lang w:val="fr-FR"/>
-        </w:rPr>
-        <w:t xml:space="preserve"> </w:t>
-      </w:r>
-      <w:proofErr w:type="spellStart"/>
-      <w:r>
-        <w:rPr>
-          <w:lang w:val="fr-FR"/>
-        </w:rPr>
-        <w:t>molestie</w:t>
-      </w:r>
-      <w:proofErr w:type="spellEnd"/>
-      <w:r>
-        <w:rPr>
-          <w:lang w:val="fr-FR"/>
-        </w:rPr>
-        <w:t xml:space="preserve">. In </w:t>
-      </w:r>
-      <w:proofErr w:type="spellStart"/>
-      <w:r>
-        <w:rPr>
-          <w:lang w:val="fr-FR"/>
-        </w:rPr>
-        <w:t>quis</w:t>
-      </w:r>
-      <w:proofErr w:type="spellEnd"/>
-      <w:r>
-        <w:rPr>
-          <w:lang w:val="fr-FR"/>
-        </w:rPr>
-        <w:t xml:space="preserve"> est </w:t>
-      </w:r>
-      <w:proofErr w:type="spellStart"/>
-      <w:r>
-        <w:rPr>
-          <w:lang w:val="fr-FR"/>
-        </w:rPr>
-        <w:t>venenatis</w:t>
-      </w:r>
-      <w:proofErr w:type="spellEnd"/>
-      <w:r>
-        <w:rPr>
-          <w:lang w:val="fr-FR"/>
-        </w:rPr>
-        <w:t xml:space="preserve">, </w:t>
-      </w:r>
-      <w:proofErr w:type="spellStart"/>
-      <w:r>
-        <w:rPr>
-          <w:lang w:val="fr-FR"/>
-        </w:rPr>
-        <w:t>tincidunt</w:t>
-      </w:r>
-      <w:proofErr w:type="spellEnd"/>
-      <w:r>
-        <w:rPr>
-          <w:lang w:val="fr-FR"/>
-        </w:rPr>
-        <w:t xml:space="preserve"> </w:t>
-      </w:r>
-      <w:proofErr w:type="spellStart"/>
-      <w:r>
-        <w:rPr>
-          <w:lang w:val="fr-FR"/>
-        </w:rPr>
-        <w:t>metus</w:t>
-      </w:r>
-      <w:proofErr w:type="spellEnd"/>
-      <w:r>
-        <w:rPr>
-          <w:lang w:val="fr-FR"/>
-        </w:rPr>
-        <w:t xml:space="preserve"> </w:t>
-      </w:r>
-      <w:proofErr w:type="spellStart"/>
-      <w:r>
-        <w:rPr>
-          <w:lang w:val="fr-FR"/>
-        </w:rPr>
-        <w:t>congue</w:t>
-      </w:r>
-      <w:proofErr w:type="spellEnd"/>
-      <w:r>
-        <w:rPr>
-          <w:lang w:val="fr-FR"/>
-        </w:rPr>
-        <w:t xml:space="preserve">, </w:t>
-      </w:r>
-      <w:proofErr w:type="spellStart"/>
-      <w:r>
-        <w:rPr>
-          <w:lang w:val="fr-FR"/>
-        </w:rPr>
-        <w:t>egestas</w:t>
-      </w:r>
-      <w:proofErr w:type="spellEnd"/>
-      <w:r>
-        <w:rPr>
-          <w:lang w:val="fr-FR"/>
-        </w:rPr>
-        <w:t xml:space="preserve"> </w:t>
-      </w:r>
-      <w:proofErr w:type="spellStart"/>
-      <w:r>
-        <w:rPr>
-          <w:lang w:val="fr-FR"/>
-        </w:rPr>
-        <w:t>neque</w:t>
-      </w:r>
-      <w:proofErr w:type="spellEnd"/>
-      <w:r>
-        <w:rPr>
-          <w:lang w:val="fr-FR"/>
-        </w:rPr>
-        <w:t xml:space="preserve">. Nunc </w:t>
-      </w:r>
-      <w:proofErr w:type="spellStart"/>
-      <w:r>
-        <w:rPr>
-          <w:lang w:val="fr-FR"/>
-        </w:rPr>
-        <w:t>quis</w:t>
-      </w:r>
-      <w:proofErr w:type="spellEnd"/>
-      <w:r>
-        <w:rPr>
-          <w:lang w:val="fr-FR"/>
-        </w:rPr>
-        <w:t xml:space="preserve"> </w:t>
-      </w:r>
-      <w:proofErr w:type="spellStart"/>
-      <w:r>
-        <w:rPr>
-          <w:lang w:val="fr-FR"/>
-        </w:rPr>
-        <w:t>maximus</w:t>
-      </w:r>
-      <w:proofErr w:type="spellEnd"/>
-      <w:r>
-        <w:rPr>
-          <w:lang w:val="fr-FR"/>
-        </w:rPr>
-        <w:t xml:space="preserve"> </w:t>
-      </w:r>
-      <w:proofErr w:type="spellStart"/>
-      <w:r>
-        <w:rPr>
-          <w:lang w:val="fr-FR"/>
-        </w:rPr>
-        <w:t>ligula</w:t>
-      </w:r>
-      <w:proofErr w:type="spellEnd"/>
-      <w:r>
-        <w:rPr>
-          <w:lang w:val="fr-FR"/>
-        </w:rPr>
-        <w:t xml:space="preserve">. </w:t>
-      </w:r>
-      <w:proofErr w:type="spellStart"/>
-      <w:r>
-        <w:rPr>
-          <w:lang w:val="fr-FR"/>
-        </w:rPr>
-        <w:t>Donec</w:t>
-      </w:r>
-      <w:proofErr w:type="spellEnd"/>
-      <w:r>
-        <w:rPr>
-          <w:lang w:val="fr-FR"/>
-        </w:rPr>
-        <w:t xml:space="preserve"> </w:t>
-      </w:r>
-      <w:proofErr w:type="spellStart"/>
-      <w:r>
-        <w:rPr>
-          <w:lang w:val="fr-FR"/>
-        </w:rPr>
-        <w:t>feugiat</w:t>
-      </w:r>
-      <w:proofErr w:type="spellEnd"/>
-      <w:r>
-        <w:rPr>
-          <w:lang w:val="fr-FR"/>
-        </w:rPr>
-        <w:t xml:space="preserve"> </w:t>
-      </w:r>
-      <w:proofErr w:type="spellStart"/>
-      <w:r>
-        <w:rPr>
-          <w:lang w:val="fr-FR"/>
-        </w:rPr>
-        <w:t>tortor</w:t>
-      </w:r>
-      <w:proofErr w:type="spellEnd"/>
-      <w:r>
-        <w:rPr>
-          <w:lang w:val="fr-FR"/>
-        </w:rPr>
-        <w:t xml:space="preserve"> </w:t>
-      </w:r>
-      <w:proofErr w:type="spellStart"/>
-      <w:r>
-        <w:rPr>
-          <w:lang w:val="fr-FR"/>
-        </w:rPr>
-        <w:t>nibh</w:t>
-      </w:r>
-      <w:proofErr w:type="spellEnd"/>
-      <w:r>
-        <w:rPr>
-          <w:lang w:val="fr-FR"/>
-        </w:rPr>
-        <w:t xml:space="preserve">, et </w:t>
-      </w:r>
-      <w:proofErr w:type="spellStart"/>
-      <w:r>
-        <w:rPr>
-          <w:lang w:val="fr-FR"/>
-        </w:rPr>
-        <w:t>euismod</w:t>
-      </w:r>
-      <w:proofErr w:type="spellEnd"/>
-      <w:r>
-        <w:rPr>
-          <w:lang w:val="fr-FR"/>
-        </w:rPr>
-        <w:t xml:space="preserve"> massa </w:t>
-      </w:r>
-      <w:proofErr w:type="spellStart"/>
-      <w:r>
-        <w:rPr>
-          <w:lang w:val="fr-FR"/>
-        </w:rPr>
-        <w:t>feugiat</w:t>
-      </w:r>
-      <w:proofErr w:type="spellEnd"/>
-      <w:r>
-        <w:rPr>
-          <w:lang w:val="fr-FR"/>
-        </w:rPr>
-        <w:t xml:space="preserve"> </w:t>
-      </w:r>
-      <w:proofErr w:type="spellStart"/>
-      <w:r>
-        <w:rPr>
-          <w:lang w:val="fr-FR"/>
-        </w:rPr>
-        <w:t>eget</w:t>
-      </w:r>
-      <w:proofErr w:type="spellEnd"/>
-      <w:r>
-        <w:rPr>
-          <w:lang w:val="fr-FR"/>
-        </w:rPr>
-        <w:t xml:space="preserve">. </w:t>
-      </w:r>
-      <w:proofErr w:type="spellStart"/>
-      <w:r>
-        <w:rPr>
-          <w:lang w:val="fr-FR"/>
-        </w:rPr>
-        <w:t>Aliquam</w:t>
-      </w:r>
-      <w:proofErr w:type="spellEnd"/>
-      <w:r>
-        <w:rPr>
-          <w:lang w:val="fr-FR"/>
-        </w:rPr>
-        <w:t xml:space="preserve"> </w:t>
-      </w:r>
-      <w:proofErr w:type="spellStart"/>
-      <w:r>
-        <w:rPr>
-          <w:lang w:val="fr-FR"/>
-        </w:rPr>
-        <w:t>sit</w:t>
-      </w:r>
-      <w:proofErr w:type="spellEnd"/>
-      <w:r>
-        <w:rPr>
-          <w:lang w:val="fr-FR"/>
-        </w:rPr>
-        <w:t xml:space="preserve"> </w:t>
-      </w:r>
-      <w:proofErr w:type="spellStart"/>
-      <w:r>
-        <w:rPr>
-          <w:lang w:val="fr-FR"/>
-        </w:rPr>
-        <w:t>amet</w:t>
-      </w:r>
-      <w:proofErr w:type="spellEnd"/>
-      <w:r>
-        <w:rPr>
-          <w:lang w:val="fr-FR"/>
-        </w:rPr>
-        <w:t xml:space="preserve"> </w:t>
-      </w:r>
-      <w:proofErr w:type="spellStart"/>
-      <w:r>
-        <w:rPr>
-          <w:lang w:val="fr-FR"/>
-        </w:rPr>
-        <w:t>metus</w:t>
-      </w:r>
-      <w:proofErr w:type="spellEnd"/>
-      <w:r>
-        <w:rPr>
-          <w:lang w:val="fr-FR"/>
-        </w:rPr>
-        <w:t xml:space="preserve"> ut </w:t>
-      </w:r>
-      <w:proofErr w:type="spellStart"/>
-      <w:r>
-        <w:rPr>
-          <w:lang w:val="fr-FR"/>
-        </w:rPr>
-        <w:t>nibh</w:t>
-      </w:r>
-      <w:proofErr w:type="spellEnd"/>
-      <w:r>
-        <w:rPr>
-          <w:lang w:val="fr-FR"/>
-        </w:rPr>
-        <w:t xml:space="preserve"> </w:t>
-      </w:r>
-      <w:proofErr w:type="spellStart"/>
-      <w:r>
-        <w:rPr>
-          <w:lang w:val="fr-FR"/>
-        </w:rPr>
-        <w:t>mattis</w:t>
-      </w:r>
-      <w:proofErr w:type="spellEnd"/>
-      <w:r>
-        <w:rPr>
-          <w:lang w:val="fr-FR"/>
-        </w:rPr>
-        <w:t xml:space="preserve"> </w:t>
-      </w:r>
-      <w:proofErr w:type="spellStart"/>
-      <w:r>
-        <w:rPr>
-          <w:lang w:val="fr-FR"/>
-        </w:rPr>
-        <w:t>venenatis</w:t>
-      </w:r>
-      <w:proofErr w:type="spellEnd"/>
-      <w:r>
-        <w:rPr>
-          <w:lang w:val="fr-FR"/>
-        </w:rPr>
-        <w:t xml:space="preserve">. </w:t>
-      </w:r>
-      <w:proofErr w:type="spellStart"/>
-      <w:r>
-        <w:rPr>
-          <w:lang w:val="fr-FR"/>
-        </w:rPr>
-        <w:t>Nulla</w:t>
-      </w:r>
-      <w:proofErr w:type="spellEnd"/>
-      <w:r>
-        <w:rPr>
-          <w:lang w:val="fr-FR"/>
-        </w:rPr>
-        <w:t xml:space="preserve"> erat mi, </w:t>
-      </w:r>
-      <w:proofErr w:type="spellStart"/>
-      <w:r>
-        <w:rPr>
-          <w:lang w:val="fr-FR"/>
-        </w:rPr>
-        <w:t>vestibulum</w:t>
-      </w:r>
-      <w:proofErr w:type="spellEnd"/>
-      <w:r>
-        <w:rPr>
-          <w:lang w:val="fr-FR"/>
-        </w:rPr>
-        <w:t xml:space="preserve"> </w:t>
-      </w:r>
-      <w:proofErr w:type="spellStart"/>
-      <w:r>
-        <w:rPr>
-          <w:lang w:val="fr-FR"/>
-        </w:rPr>
-        <w:t>quis</w:t>
-      </w:r>
-      <w:proofErr w:type="spellEnd"/>
-      <w:r>
-        <w:rPr>
-          <w:lang w:val="fr-FR"/>
-        </w:rPr>
-        <w:t xml:space="preserve"> </w:t>
-      </w:r>
-      <w:proofErr w:type="spellStart"/>
-      <w:r>
-        <w:rPr>
-          <w:lang w:val="fr-FR"/>
-        </w:rPr>
-        <w:t>purus</w:t>
-      </w:r>
-      <w:proofErr w:type="spellEnd"/>
-      <w:r>
-        <w:rPr>
-          <w:lang w:val="fr-FR"/>
-        </w:rPr>
-        <w:t xml:space="preserve"> </w:t>
-      </w:r>
-      <w:proofErr w:type="spellStart"/>
-      <w:r>
-        <w:rPr>
-          <w:lang w:val="fr-FR"/>
-        </w:rPr>
-        <w:t>aliquam</w:t>
-      </w:r>
-      <w:proofErr w:type="spellEnd"/>
-      <w:r>
-        <w:rPr>
-          <w:lang w:val="fr-FR"/>
-        </w:rPr>
-        <w:t xml:space="preserve">, </w:t>
-      </w:r>
-      <w:proofErr w:type="spellStart"/>
-      <w:r>
-        <w:rPr>
-          <w:lang w:val="fr-FR"/>
-        </w:rPr>
-        <w:t>condimentum</w:t>
-      </w:r>
-      <w:proofErr w:type="spellEnd"/>
-      <w:r>
-        <w:rPr>
-          <w:lang w:val="fr-FR"/>
-        </w:rPr>
-        <w:t xml:space="preserve"> </w:t>
-      </w:r>
-      <w:proofErr w:type="spellStart"/>
-      <w:r>
-        <w:rPr>
-          <w:lang w:val="fr-FR"/>
-        </w:rPr>
-        <w:t>tempor</w:t>
-      </w:r>
-      <w:proofErr w:type="spellEnd"/>
-      <w:r>
-        <w:rPr>
-          <w:lang w:val="fr-FR"/>
-        </w:rPr>
-        <w:t xml:space="preserve"> </w:t>
-      </w:r>
-      <w:proofErr w:type="spellStart"/>
-      <w:r>
-        <w:rPr>
-          <w:lang w:val="fr-FR"/>
-        </w:rPr>
-        <w:t>lacus</w:t>
-      </w:r>
-      <w:proofErr w:type="spellEnd"/>
-      <w:r>
-        <w:rPr>
-          <w:lang w:val="fr-FR"/>
-        </w:rPr>
-        <w:t xml:space="preserve">. </w:t>
-      </w:r>
-      <w:proofErr w:type="spellStart"/>
-      <w:r>
-        <w:rPr>
-          <w:lang w:val="fr-FR"/>
-        </w:rPr>
-        <w:t>Aliquam</w:t>
-      </w:r>
-      <w:proofErr w:type="spellEnd"/>
-      <w:r>
-        <w:rPr>
-          <w:lang w:val="fr-FR"/>
-        </w:rPr>
-        <w:t xml:space="preserve"> erat </w:t>
-      </w:r>
-      <w:proofErr w:type="spellStart"/>
-      <w:r>
-        <w:rPr>
-          <w:lang w:val="fr-FR"/>
-        </w:rPr>
-        <w:t>volutpat</w:t>
-      </w:r>
-      <w:proofErr w:type="spellEnd"/>
-      <w:r>
-        <w:rPr>
-          <w:lang w:val="fr-FR"/>
-        </w:rPr>
-        <w:t xml:space="preserve">. </w:t>
-      </w:r>
-      <w:proofErr w:type="spellStart"/>
-      <w:r>
-        <w:rPr>
-          <w:lang w:val="fr-FR"/>
-        </w:rPr>
-        <w:t>Vivamus</w:t>
-      </w:r>
-      <w:proofErr w:type="spellEnd"/>
-      <w:r>
-        <w:rPr>
-          <w:lang w:val="fr-FR"/>
-        </w:rPr>
-        <w:t xml:space="preserve"> magna </w:t>
-      </w:r>
-      <w:proofErr w:type="spellStart"/>
-      <w:r>
-        <w:rPr>
-          <w:lang w:val="fr-FR"/>
-        </w:rPr>
-        <w:t>turpis</w:t>
-      </w:r>
-      <w:proofErr w:type="spellEnd"/>
-      <w:r>
-        <w:rPr>
-          <w:lang w:val="fr-FR"/>
-        </w:rPr>
-        <w:t xml:space="preserve">, </w:t>
-      </w:r>
-      <w:proofErr w:type="spellStart"/>
-      <w:r>
-        <w:rPr>
-          <w:lang w:val="fr-FR"/>
-        </w:rPr>
-        <w:t>maximus</w:t>
-      </w:r>
-      <w:proofErr w:type="spellEnd"/>
-      <w:r>
-        <w:rPr>
-          <w:lang w:val="fr-FR"/>
-        </w:rPr>
-        <w:t xml:space="preserve"> in </w:t>
-      </w:r>
-      <w:proofErr w:type="spellStart"/>
-      <w:r>
-        <w:rPr>
-          <w:lang w:val="fr-FR"/>
-        </w:rPr>
-        <w:t>neque</w:t>
-      </w:r>
-      <w:proofErr w:type="spellEnd"/>
-      <w:r>
-        <w:rPr>
-          <w:lang w:val="fr-FR"/>
-        </w:rPr>
-        <w:t xml:space="preserve"> </w:t>
-      </w:r>
-      <w:proofErr w:type="spellStart"/>
-      <w:r>
-        <w:rPr>
-          <w:lang w:val="fr-FR"/>
-        </w:rPr>
-        <w:t>rutrum</w:t>
-      </w:r>
-      <w:proofErr w:type="spellEnd"/>
-      <w:r>
-        <w:rPr>
-          <w:lang w:val="fr-FR"/>
-        </w:rPr>
-        <w:t xml:space="preserve">, dictum </w:t>
-      </w:r>
-      <w:proofErr w:type="spellStart"/>
-      <w:r>
-        <w:rPr>
-          <w:lang w:val="fr-FR"/>
-        </w:rPr>
-        <w:t>blandit</w:t>
-      </w:r>
-      <w:proofErr w:type="spellEnd"/>
-      <w:r>
-        <w:rPr>
-          <w:lang w:val="fr-FR"/>
-        </w:rPr>
-        <w:t xml:space="preserve"> </w:t>
-      </w:r>
-      <w:proofErr w:type="spellStart"/>
-      <w:r>
-        <w:rPr>
-          <w:lang w:val="fr-FR"/>
-        </w:rPr>
-        <w:t>leo</w:t>
-      </w:r>
-      <w:proofErr w:type="spellEnd"/>
-      <w:r>
-        <w:rPr>
-          <w:lang w:val="fr-FR"/>
-        </w:rPr>
-        <w:t xml:space="preserve">. Morbi </w:t>
-      </w:r>
-      <w:proofErr w:type="spellStart"/>
-      <w:r>
-        <w:rPr>
-          <w:lang w:val="fr-FR"/>
-        </w:rPr>
-        <w:t>vehicula</w:t>
-      </w:r>
-      <w:proofErr w:type="spellEnd"/>
-      <w:r>
-        <w:rPr>
-          <w:lang w:val="fr-FR"/>
-        </w:rPr>
-        <w:t xml:space="preserve"> </w:t>
-      </w:r>
-      <w:proofErr w:type="spellStart"/>
-      <w:r>
-        <w:rPr>
-          <w:lang w:val="fr-FR"/>
-        </w:rPr>
-        <w:t>congue</w:t>
-      </w:r>
-      <w:proofErr w:type="spellEnd"/>
-      <w:r>
-        <w:rPr>
-          <w:lang w:val="fr-FR"/>
-        </w:rPr>
-        <w:t xml:space="preserve"> </w:t>
-      </w:r>
-      <w:proofErr w:type="spellStart"/>
-      <w:r>
-        <w:rPr>
-          <w:lang w:val="fr-FR"/>
-        </w:rPr>
-        <w:t>nulla</w:t>
-      </w:r>
-      <w:proofErr w:type="spellEnd"/>
-      <w:r>
-        <w:rPr>
-          <w:lang w:val="fr-FR"/>
-        </w:rPr>
-        <w:t xml:space="preserve">, </w:t>
-      </w:r>
-      <w:proofErr w:type="spellStart"/>
-      <w:r>
-        <w:rPr>
-          <w:lang w:val="fr-FR"/>
-        </w:rPr>
-        <w:t>quis</w:t>
-      </w:r>
-      <w:proofErr w:type="spellEnd"/>
-      <w:r>
-        <w:rPr>
-          <w:lang w:val="fr-FR"/>
-        </w:rPr>
-        <w:t xml:space="preserve"> </w:t>
-      </w:r>
-      <w:proofErr w:type="spellStart"/>
-      <w:r>
-        <w:rPr>
-          <w:lang w:val="fr-FR"/>
-        </w:rPr>
-        <w:t>ullamcorper</w:t>
-      </w:r>
-      <w:proofErr w:type="spellEnd"/>
-      <w:r>
-        <w:rPr>
-          <w:lang w:val="fr-FR"/>
-        </w:rPr>
-        <w:t xml:space="preserve"> </w:t>
-      </w:r>
-      <w:proofErr w:type="spellStart"/>
-      <w:r>
-        <w:rPr>
-          <w:lang w:val="fr-FR"/>
-        </w:rPr>
-        <w:t>tellus</w:t>
-      </w:r>
-      <w:proofErr w:type="spellEnd"/>
-      <w:r>
-        <w:rPr>
-          <w:lang w:val="fr-FR"/>
-        </w:rPr>
-        <w:t xml:space="preserve"> </w:t>
-      </w:r>
-      <w:proofErr w:type="spellStart"/>
-      <w:r>
-        <w:rPr>
-          <w:lang w:val="fr-FR"/>
-        </w:rPr>
-        <w:t>finibus</w:t>
-      </w:r>
-      <w:proofErr w:type="spellEnd"/>
-      <w:r>
-        <w:rPr>
-          <w:lang w:val="fr-FR"/>
-        </w:rPr>
-        <w:t xml:space="preserve"> mollis. </w:t>
-      </w:r>
-      <w:r>
-        <w:rPr>
-          <w:lang w:val="fr-FR"/>
-        </w:rPr>
-        <w:t xml:space="preserve">Sed id </w:t>
-      </w:r>
-      <w:proofErr w:type="spellStart"/>
-      <w:r>
-        <w:rPr>
-          <w:lang w:val="fr-FR"/>
-        </w:rPr>
-        <w:t>mauris</w:t>
-      </w:r>
-      <w:proofErr w:type="spellEnd"/>
-      <w:r>
-        <w:rPr>
-          <w:lang w:val="fr-FR"/>
-        </w:rPr>
-        <w:t xml:space="preserve"> at </w:t>
-      </w:r>
-      <w:proofErr w:type="spellStart"/>
-      <w:r>
-        <w:rPr>
-          <w:lang w:val="fr-FR"/>
-        </w:rPr>
-        <w:t>purus</w:t>
-      </w:r>
-      <w:proofErr w:type="spellEnd"/>
-      <w:r>
-        <w:rPr>
-          <w:lang w:val="fr-FR"/>
-        </w:rPr>
-        <w:t xml:space="preserve"> </w:t>
-      </w:r>
-      <w:proofErr w:type="spellStart"/>
-      <w:r>
-        <w:rPr>
-          <w:lang w:val="fr-FR"/>
-        </w:rPr>
-        <w:t>efficitur</w:t>
-      </w:r>
-      <w:proofErr w:type="spellEnd"/>
-      <w:r>
-        <w:rPr>
-          <w:lang w:val="fr-FR"/>
-        </w:rPr>
-        <w:t xml:space="preserve"> </w:t>
-      </w:r>
-      <w:proofErr w:type="spellStart"/>
-      <w:r>
-        <w:rPr>
-          <w:lang w:val="fr-FR"/>
-        </w:rPr>
-        <w:t>vulputate</w:t>
-      </w:r>
-      <w:proofErr w:type="spellEnd"/>
-      <w:r>
-        <w:rPr>
-          <w:lang w:val="fr-FR"/>
-        </w:rPr>
-        <w:t xml:space="preserve"> vitae a </w:t>
-      </w:r>
-      <w:proofErr w:type="spellStart"/>
-      <w:r>
-        <w:rPr>
-          <w:lang w:val="fr-FR"/>
-        </w:rPr>
-        <w:t>sapien</w:t>
-      </w:r>
-      <w:proofErr w:type="spellEnd"/>
-      <w:r>
-        <w:rPr>
-          <w:lang w:val="fr-FR"/>
-        </w:rPr>
-        <w:t>.</w:t>
-      </w:r>
-    </w:p>
-    <w:p>
-      <w:pPr>
-        <w:pStyle w:val="Heading1"/>
         <w:rPr>
           <w:lang w:val="fr-FR"/>
         </w:rPr>
@@ -2157,6 +1071,1080 @@
           <w:docGrid w:linePitch="360"/>
         </w:sectPr>
       </w:pPr>
+      <w:r>
+        <w:rPr>
+          <w:lang w:val="en-CA"/>
+        </w:rPr>
+        <w:t xml:space="preserve">Lorem ipsum dolor </w:t>
+      </w:r>
+      <w:proofErr w:type="gramStart"/>
+      <w:r>
+        <w:rPr>
+          <w:lang w:val="en-CA"/>
+        </w:rPr>
+        <w:t>sit</w:t>
+      </w:r>
+      <w:proofErr w:type="gramEnd"/>
+      <w:r>
+        <w:rPr>
+          <w:lang w:val="en-CA"/>
+        </w:rPr>
+        <w:t xml:space="preserve"> </w:t>
+      </w:r>
+      <w:proofErr w:type="spellStart"/>
+      <w:r>
+        <w:rPr>
+          <w:lang w:val="en-CA"/>
+        </w:rPr>
+        <w:t>amet</w:t>
+      </w:r>
+      <w:proofErr w:type="spellEnd"/>
+      <w:r>
+        <w:rPr>
+          <w:lang w:val="en-CA"/>
+        </w:rPr>
+        <w:t xml:space="preserve">, </w:t>
+      </w:r>
+      <w:proofErr w:type="spellStart"/>
+      <w:r>
+        <w:rPr>
+          <w:lang w:val="en-CA"/>
+        </w:rPr>
+        <w:t>consectetur</w:t>
+      </w:r>
+      <w:proofErr w:type="spellEnd"/>
+      <w:r>
+        <w:rPr>
+          <w:lang w:val="en-CA"/>
+        </w:rPr>
+        <w:t xml:space="preserve"> </w:t>
+      </w:r>
+      <w:proofErr w:type="spellStart"/>
+      <w:r>
+        <w:rPr>
+          <w:lang w:val="en-CA"/>
+        </w:rPr>
+        <w:t>adipiscing</w:t>
+      </w:r>
+      <w:proofErr w:type="spellEnd"/>
+      <w:r>
+        <w:rPr>
+          <w:lang w:val="en-CA"/>
+        </w:rPr>
+        <w:t xml:space="preserve"> </w:t>
+      </w:r>
+      <w:proofErr w:type="spellStart"/>
+      <w:r>
+        <w:rPr>
+          <w:lang w:val="en-CA"/>
+        </w:rPr>
+        <w:t>elit</w:t>
+      </w:r>
+      <w:proofErr w:type="spellEnd"/>
+      <w:r>
+        <w:rPr>
+          <w:lang w:val="en-CA"/>
+        </w:rPr>
+        <w:t xml:space="preserve">. </w:t>
+      </w:r>
+      <w:proofErr w:type="spellStart"/>
+      <w:r>
+        <w:rPr>
+          <w:lang w:val="en-CA"/>
+        </w:rPr>
+        <w:t>Phasellus</w:t>
+      </w:r>
+      <w:proofErr w:type="spellEnd"/>
+      <w:r>
+        <w:rPr>
+          <w:lang w:val="en-CA"/>
+        </w:rPr>
+        <w:t xml:space="preserve"> </w:t>
+      </w:r>
+      <w:proofErr w:type="spellStart"/>
+      <w:r>
+        <w:rPr>
+          <w:lang w:val="en-CA"/>
+        </w:rPr>
+        <w:t>eget</w:t>
+      </w:r>
+      <w:proofErr w:type="spellEnd"/>
+      <w:r>
+        <w:rPr>
+          <w:lang w:val="en-CA"/>
+        </w:rPr>
+        <w:t xml:space="preserve"> </w:t>
+      </w:r>
+      <w:proofErr w:type="spellStart"/>
+      <w:r>
+        <w:rPr>
+          <w:lang w:val="en-CA"/>
+        </w:rPr>
+        <w:t>turpis</w:t>
+      </w:r>
+      <w:proofErr w:type="spellEnd"/>
+      <w:r>
+        <w:rPr>
+          <w:lang w:val="en-CA"/>
+        </w:rPr>
+        <w:t xml:space="preserve"> nec </w:t>
+      </w:r>
+      <w:proofErr w:type="spellStart"/>
+      <w:r>
+        <w:rPr>
+          <w:lang w:val="en-CA"/>
+        </w:rPr>
+        <w:t>risus</w:t>
+      </w:r>
+      <w:proofErr w:type="spellEnd"/>
+      <w:r>
+        <w:rPr>
+          <w:lang w:val="en-CA"/>
+        </w:rPr>
+        <w:t xml:space="preserve"> </w:t>
+      </w:r>
+      <w:proofErr w:type="spellStart"/>
+      <w:r>
+        <w:rPr>
+          <w:lang w:val="en-CA"/>
+        </w:rPr>
+        <w:t>ultricies</w:t>
+      </w:r>
+      <w:proofErr w:type="spellEnd"/>
+      <w:r>
+        <w:rPr>
+          <w:lang w:val="en-CA"/>
+        </w:rPr>
+        <w:t xml:space="preserve"> </w:t>
+      </w:r>
+      <w:proofErr w:type="spellStart"/>
+      <w:r>
+        <w:rPr>
+          <w:lang w:val="en-CA"/>
+        </w:rPr>
+        <w:t>fringilla</w:t>
+      </w:r>
+      <w:proofErr w:type="spellEnd"/>
+      <w:r>
+        <w:rPr>
+          <w:lang w:val="en-CA"/>
+        </w:rPr>
+        <w:t xml:space="preserve"> ac in </w:t>
+      </w:r>
+      <w:proofErr w:type="spellStart"/>
+      <w:r>
+        <w:rPr>
+          <w:lang w:val="en-CA"/>
+        </w:rPr>
+        <w:t>arcu</w:t>
+      </w:r>
+      <w:proofErr w:type="spellEnd"/>
+      <w:r>
+        <w:rPr>
+          <w:lang w:val="en-CA"/>
+        </w:rPr>
+        <w:t xml:space="preserve">. </w:t>
+      </w:r>
+      <w:proofErr w:type="spellStart"/>
+      <w:r>
+        <w:rPr>
+          <w:lang w:val="fr-FR"/>
+        </w:rPr>
+        <w:t>Vivamus</w:t>
+      </w:r>
+      <w:proofErr w:type="spellEnd"/>
+      <w:r>
+        <w:rPr>
+          <w:lang w:val="fr-FR"/>
+        </w:rPr>
+        <w:t xml:space="preserve"> </w:t>
+      </w:r>
+      <w:proofErr w:type="spellStart"/>
+      <w:r>
+        <w:rPr>
+          <w:lang w:val="fr-FR"/>
+        </w:rPr>
+        <w:t>faucibus</w:t>
+      </w:r>
+      <w:proofErr w:type="spellEnd"/>
+      <w:r>
+        <w:rPr>
+          <w:lang w:val="fr-FR"/>
+        </w:rPr>
+        <w:t xml:space="preserve"> </w:t>
+      </w:r>
+      <w:proofErr w:type="spellStart"/>
+      <w:r>
+        <w:rPr>
+          <w:lang w:val="fr-FR"/>
+        </w:rPr>
+        <w:t>venenatis</w:t>
+      </w:r>
+      <w:proofErr w:type="spellEnd"/>
+      <w:r>
+        <w:rPr>
+          <w:lang w:val="fr-FR"/>
+        </w:rPr>
+        <w:t xml:space="preserve"> </w:t>
+      </w:r>
+      <w:proofErr w:type="spellStart"/>
+      <w:r>
+        <w:rPr>
+          <w:lang w:val="fr-FR"/>
+        </w:rPr>
+        <w:t>nisi</w:t>
+      </w:r>
+      <w:proofErr w:type="spellEnd"/>
+      <w:r>
+        <w:rPr>
+          <w:lang w:val="fr-FR"/>
+        </w:rPr>
+        <w:t xml:space="preserve"> </w:t>
+      </w:r>
+      <w:proofErr w:type="spellStart"/>
+      <w:r>
+        <w:rPr>
+          <w:lang w:val="fr-FR"/>
+        </w:rPr>
+        <w:t>eget</w:t>
+      </w:r>
+      <w:proofErr w:type="spellEnd"/>
+      <w:r>
+        <w:rPr>
+          <w:lang w:val="fr-FR"/>
+        </w:rPr>
+        <w:t xml:space="preserve"> </w:t>
+      </w:r>
+      <w:proofErr w:type="spellStart"/>
+      <w:r>
+        <w:rPr>
+          <w:lang w:val="fr-FR"/>
+        </w:rPr>
+        <w:t>vestibulum</w:t>
+      </w:r>
+      <w:proofErr w:type="spellEnd"/>
+      <w:r>
+        <w:rPr>
+          <w:lang w:val="fr-FR"/>
+        </w:rPr>
+        <w:t xml:space="preserve">. Integer nec est </w:t>
+      </w:r>
+      <w:proofErr w:type="spellStart"/>
+      <w:r>
+        <w:rPr>
+          <w:lang w:val="fr-FR"/>
+        </w:rPr>
+        <w:t>quis</w:t>
+      </w:r>
+      <w:proofErr w:type="spellEnd"/>
+      <w:r>
+        <w:rPr>
+          <w:lang w:val="fr-FR"/>
+        </w:rPr>
+        <w:t xml:space="preserve"> </w:t>
+      </w:r>
+      <w:proofErr w:type="spellStart"/>
+      <w:r>
+        <w:rPr>
+          <w:lang w:val="fr-FR"/>
+        </w:rPr>
+        <w:t>metus</w:t>
+      </w:r>
+      <w:proofErr w:type="spellEnd"/>
+      <w:r>
+        <w:rPr>
+          <w:lang w:val="fr-FR"/>
+        </w:rPr>
+        <w:t xml:space="preserve"> </w:t>
+      </w:r>
+      <w:proofErr w:type="spellStart"/>
+      <w:r>
+        <w:rPr>
+          <w:lang w:val="fr-FR"/>
+        </w:rPr>
+        <w:t>vulputate</w:t>
+      </w:r>
+      <w:proofErr w:type="spellEnd"/>
+      <w:r>
+        <w:rPr>
+          <w:lang w:val="fr-FR"/>
+        </w:rPr>
+        <w:t xml:space="preserve"> </w:t>
+      </w:r>
+      <w:proofErr w:type="spellStart"/>
+      <w:r>
+        <w:rPr>
+          <w:lang w:val="fr-FR"/>
+        </w:rPr>
+        <w:t>molestie</w:t>
+      </w:r>
+      <w:proofErr w:type="spellEnd"/>
+      <w:r>
+        <w:rPr>
+          <w:lang w:val="fr-FR"/>
+        </w:rPr>
+        <w:t xml:space="preserve">. In </w:t>
+      </w:r>
+      <w:proofErr w:type="spellStart"/>
+      <w:r>
+        <w:rPr>
+          <w:lang w:val="fr-FR"/>
+        </w:rPr>
+        <w:t>quis</w:t>
+      </w:r>
+      <w:proofErr w:type="spellEnd"/>
+      <w:r>
+        <w:rPr>
+          <w:lang w:val="fr-FR"/>
+        </w:rPr>
+        <w:t xml:space="preserve"> est </w:t>
+      </w:r>
+      <w:proofErr w:type="spellStart"/>
+      <w:r>
+        <w:rPr>
+          <w:lang w:val="fr-FR"/>
+        </w:rPr>
+        <w:t>venenatis</w:t>
+      </w:r>
+      <w:proofErr w:type="spellEnd"/>
+      <w:r>
+        <w:rPr>
+          <w:lang w:val="fr-FR"/>
+        </w:rPr>
+        <w:t xml:space="preserve">, </w:t>
+      </w:r>
+      <w:proofErr w:type="spellStart"/>
+      <w:r>
+        <w:rPr>
+          <w:lang w:val="fr-FR"/>
+        </w:rPr>
+        <w:t>tincidunt</w:t>
+      </w:r>
+      <w:proofErr w:type="spellEnd"/>
+      <w:r>
+        <w:rPr>
+          <w:lang w:val="fr-FR"/>
+        </w:rPr>
+        <w:t xml:space="preserve"> </w:t>
+      </w:r>
+      <w:proofErr w:type="spellStart"/>
+      <w:r>
+        <w:rPr>
+          <w:lang w:val="fr-FR"/>
+        </w:rPr>
+        <w:t>metus</w:t>
+      </w:r>
+      <w:proofErr w:type="spellEnd"/>
+      <w:r>
+        <w:rPr>
+          <w:lang w:val="fr-FR"/>
+        </w:rPr>
+        <w:t xml:space="preserve"> </w:t>
+      </w:r>
+      <w:proofErr w:type="spellStart"/>
+      <w:r>
+        <w:rPr>
+          <w:lang w:val="fr-FR"/>
+        </w:rPr>
+        <w:t>congue</w:t>
+      </w:r>
+      <w:proofErr w:type="spellEnd"/>
+      <w:r>
+        <w:rPr>
+          <w:lang w:val="fr-FR"/>
+        </w:rPr>
+        <w:t xml:space="preserve">, </w:t>
+      </w:r>
+      <w:proofErr w:type="spellStart"/>
+      <w:r>
+        <w:rPr>
+          <w:lang w:val="fr-FR"/>
+        </w:rPr>
+        <w:t>egestas</w:t>
+      </w:r>
+      <w:proofErr w:type="spellEnd"/>
+      <w:r>
+        <w:rPr>
+          <w:lang w:val="fr-FR"/>
+        </w:rPr>
+        <w:t xml:space="preserve"> </w:t>
+      </w:r>
+      <w:proofErr w:type="spellStart"/>
+      <w:r>
+        <w:rPr>
+          <w:lang w:val="fr-FR"/>
+        </w:rPr>
+        <w:t>neque</w:t>
+      </w:r>
+      <w:proofErr w:type="spellEnd"/>
+      <w:r>
+        <w:rPr>
+          <w:lang w:val="fr-FR"/>
+        </w:rPr>
+        <w:t xml:space="preserve">. Nunc </w:t>
+      </w:r>
+      <w:proofErr w:type="spellStart"/>
+      <w:r>
+        <w:rPr>
+          <w:lang w:val="fr-FR"/>
+        </w:rPr>
+        <w:t>quis</w:t>
+      </w:r>
+      <w:proofErr w:type="spellEnd"/>
+      <w:r>
+        <w:rPr>
+          <w:lang w:val="fr-FR"/>
+        </w:rPr>
+        <w:t xml:space="preserve"> </w:t>
+      </w:r>
+      <w:proofErr w:type="spellStart"/>
+      <w:r>
+        <w:rPr>
+          <w:lang w:val="fr-FR"/>
+        </w:rPr>
+        <w:t>maximus</w:t>
+      </w:r>
+      <w:proofErr w:type="spellEnd"/>
+      <w:r>
+        <w:rPr>
+          <w:lang w:val="fr-FR"/>
+        </w:rPr>
+        <w:t xml:space="preserve"> </w:t>
+      </w:r>
+      <w:proofErr w:type="spellStart"/>
+      <w:r>
+        <w:rPr>
+          <w:lang w:val="fr-FR"/>
+        </w:rPr>
+        <w:t>ligula</w:t>
+      </w:r>
+      <w:proofErr w:type="spellEnd"/>
+      <w:r>
+        <w:rPr>
+          <w:lang w:val="fr-FR"/>
+        </w:rPr>
+        <w:t xml:space="preserve">. </w:t>
+      </w:r>
+      <w:proofErr w:type="spellStart"/>
+      <w:r>
+        <w:rPr>
+          <w:lang w:val="fr-FR"/>
+        </w:rPr>
+        <w:t>Donec</w:t>
+      </w:r>
+      <w:proofErr w:type="spellEnd"/>
+      <w:r>
+        <w:rPr>
+          <w:lang w:val="fr-FR"/>
+        </w:rPr>
+        <w:t xml:space="preserve"> </w:t>
+      </w:r>
+      <w:proofErr w:type="spellStart"/>
+      <w:r>
+        <w:rPr>
+          <w:lang w:val="fr-FR"/>
+        </w:rPr>
+        <w:t>feugiat</w:t>
+      </w:r>
+      <w:proofErr w:type="spellEnd"/>
+      <w:r>
+        <w:rPr>
+          <w:lang w:val="fr-FR"/>
+        </w:rPr>
+        <w:t xml:space="preserve"> </w:t>
+      </w:r>
+      <w:proofErr w:type="spellStart"/>
+      <w:r>
+        <w:rPr>
+          <w:lang w:val="fr-FR"/>
+        </w:rPr>
+        <w:t>tortor</w:t>
+      </w:r>
+      <w:proofErr w:type="spellEnd"/>
+      <w:r>
+        <w:rPr>
+          <w:lang w:val="fr-FR"/>
+        </w:rPr>
+        <w:t xml:space="preserve"> </w:t>
+      </w:r>
+      <w:proofErr w:type="spellStart"/>
+      <w:r>
+        <w:rPr>
+          <w:lang w:val="fr-FR"/>
+        </w:rPr>
+        <w:t>nibh</w:t>
+      </w:r>
+      <w:proofErr w:type="spellEnd"/>
+      <w:r>
+        <w:rPr>
+          <w:lang w:val="fr-FR"/>
+        </w:rPr>
+        <w:t xml:space="preserve">, et </w:t>
+      </w:r>
+      <w:proofErr w:type="spellStart"/>
+      <w:r>
+        <w:rPr>
+          <w:lang w:val="fr-FR"/>
+        </w:rPr>
+        <w:t>euismod</w:t>
+      </w:r>
+      <w:proofErr w:type="spellEnd"/>
+      <w:r>
+        <w:rPr>
+          <w:lang w:val="fr-FR"/>
+        </w:rPr>
+        <w:t xml:space="preserve"> massa </w:t>
+      </w:r>
+      <w:proofErr w:type="spellStart"/>
+      <w:r>
+        <w:rPr>
+          <w:lang w:val="fr-FR"/>
+        </w:rPr>
+        <w:t>feugiat</w:t>
+      </w:r>
+      <w:proofErr w:type="spellEnd"/>
+      <w:r>
+        <w:rPr>
+          <w:lang w:val="fr-FR"/>
+        </w:rPr>
+        <w:t xml:space="preserve"> </w:t>
+      </w:r>
+      <w:proofErr w:type="spellStart"/>
+      <w:r>
+        <w:rPr>
+          <w:lang w:val="fr-FR"/>
+        </w:rPr>
+        <w:t>eget</w:t>
+      </w:r>
+      <w:proofErr w:type="spellEnd"/>
+      <w:r>
+        <w:rPr>
+          <w:lang w:val="fr-FR"/>
+        </w:rPr>
+        <w:t xml:space="preserve">. </w:t>
+      </w:r>
+      <w:proofErr w:type="spellStart"/>
+      <w:r>
+        <w:rPr>
+          <w:lang w:val="fr-FR"/>
+        </w:rPr>
+        <w:t>Aliquam</w:t>
+      </w:r>
+      <w:proofErr w:type="spellEnd"/>
+      <w:r>
+        <w:rPr>
+          <w:lang w:val="fr-FR"/>
+        </w:rPr>
+        <w:t xml:space="preserve"> </w:t>
+      </w:r>
+      <w:proofErr w:type="spellStart"/>
+      <w:r>
+        <w:rPr>
+          <w:lang w:val="fr-FR"/>
+        </w:rPr>
+        <w:t>sit</w:t>
+      </w:r>
+      <w:proofErr w:type="spellEnd"/>
+      <w:r>
+        <w:rPr>
+          <w:lang w:val="fr-FR"/>
+        </w:rPr>
+        <w:t xml:space="preserve"> </w:t>
+      </w:r>
+      <w:proofErr w:type="spellStart"/>
+      <w:r>
+        <w:rPr>
+          <w:lang w:val="fr-FR"/>
+        </w:rPr>
+        <w:t>amet</w:t>
+      </w:r>
+      <w:proofErr w:type="spellEnd"/>
+      <w:r>
+        <w:rPr>
+          <w:lang w:val="fr-FR"/>
+        </w:rPr>
+        <w:t xml:space="preserve"> </w:t>
+      </w:r>
+      <w:proofErr w:type="spellStart"/>
+      <w:r>
+        <w:rPr>
+          <w:lang w:val="fr-FR"/>
+        </w:rPr>
+        <w:t>metus</w:t>
+      </w:r>
+      <w:proofErr w:type="spellEnd"/>
+      <w:r>
+        <w:rPr>
+          <w:lang w:val="fr-FR"/>
+        </w:rPr>
+        <w:t xml:space="preserve"> ut </w:t>
+      </w:r>
+      <w:proofErr w:type="spellStart"/>
+      <w:r>
+        <w:rPr>
+          <w:lang w:val="fr-FR"/>
+        </w:rPr>
+        <w:t>nibh</w:t>
+      </w:r>
+      <w:proofErr w:type="spellEnd"/>
+      <w:r>
+        <w:rPr>
+          <w:lang w:val="fr-FR"/>
+        </w:rPr>
+        <w:t xml:space="preserve"> </w:t>
+      </w:r>
+      <w:proofErr w:type="spellStart"/>
+      <w:r>
+        <w:rPr>
+          <w:lang w:val="fr-FR"/>
+        </w:rPr>
+        <w:t>mattis</w:t>
+      </w:r>
+      <w:proofErr w:type="spellEnd"/>
+      <w:r>
+        <w:rPr>
+          <w:lang w:val="fr-FR"/>
+        </w:rPr>
+        <w:t xml:space="preserve"> </w:t>
+      </w:r>
+      <w:proofErr w:type="spellStart"/>
+      <w:r>
+        <w:rPr>
+          <w:lang w:val="fr-FR"/>
+        </w:rPr>
+        <w:t>venenatis</w:t>
+      </w:r>
+      <w:proofErr w:type="spellEnd"/>
+      <w:r>
+        <w:rPr>
+          <w:lang w:val="fr-FR"/>
+        </w:rPr>
+        <w:t xml:space="preserve">. </w:t>
+      </w:r>
+      <w:proofErr w:type="spellStart"/>
+      <w:r>
+        <w:rPr>
+          <w:lang w:val="fr-FR"/>
+        </w:rPr>
+        <w:t>Nulla</w:t>
+      </w:r>
+      <w:proofErr w:type="spellEnd"/>
+      <w:r>
+        <w:rPr>
+          <w:lang w:val="fr-FR"/>
+        </w:rPr>
+        <w:t xml:space="preserve"> erat mi, </w:t>
+      </w:r>
+      <w:proofErr w:type="spellStart"/>
+      <w:r>
+        <w:rPr>
+          <w:lang w:val="fr-FR"/>
+        </w:rPr>
+        <w:t>vestibulum</w:t>
+      </w:r>
+      <w:proofErr w:type="spellEnd"/>
+      <w:r>
+        <w:rPr>
+          <w:lang w:val="fr-FR"/>
+        </w:rPr>
+        <w:t xml:space="preserve"> </w:t>
+      </w:r>
+      <w:proofErr w:type="spellStart"/>
+      <w:r>
+        <w:rPr>
+          <w:lang w:val="fr-FR"/>
+        </w:rPr>
+        <w:t>quis</w:t>
+      </w:r>
+      <w:proofErr w:type="spellEnd"/>
+      <w:r>
+        <w:rPr>
+          <w:lang w:val="fr-FR"/>
+        </w:rPr>
+        <w:t xml:space="preserve"> </w:t>
+      </w:r>
+      <w:proofErr w:type="spellStart"/>
+      <w:r>
+        <w:rPr>
+          <w:lang w:val="fr-FR"/>
+        </w:rPr>
+        <w:t>purus</w:t>
+      </w:r>
+      <w:proofErr w:type="spellEnd"/>
+      <w:r>
+        <w:rPr>
+          <w:lang w:val="fr-FR"/>
+        </w:rPr>
+        <w:t xml:space="preserve"> </w:t>
+      </w:r>
+      <w:proofErr w:type="spellStart"/>
+      <w:r>
+        <w:rPr>
+          <w:lang w:val="fr-FR"/>
+        </w:rPr>
+        <w:t>aliquam</w:t>
+      </w:r>
+      <w:proofErr w:type="spellEnd"/>
+      <w:r>
+        <w:rPr>
+          <w:lang w:val="fr-FR"/>
+        </w:rPr>
+        <w:t xml:space="preserve">, </w:t>
+      </w:r>
+      <w:proofErr w:type="spellStart"/>
+      <w:r>
+        <w:rPr>
+          <w:lang w:val="fr-FR"/>
+        </w:rPr>
+        <w:t>condimentum</w:t>
+      </w:r>
+      <w:proofErr w:type="spellEnd"/>
+      <w:r>
+        <w:rPr>
+          <w:lang w:val="fr-FR"/>
+        </w:rPr>
+        <w:t xml:space="preserve"> </w:t>
+      </w:r>
+      <w:proofErr w:type="spellStart"/>
+      <w:r>
+        <w:rPr>
+          <w:lang w:val="fr-FR"/>
+        </w:rPr>
+        <w:t>tempor</w:t>
+      </w:r>
+      <w:proofErr w:type="spellEnd"/>
+      <w:r>
+        <w:rPr>
+          <w:lang w:val="fr-FR"/>
+        </w:rPr>
+        <w:t xml:space="preserve"> </w:t>
+      </w:r>
+      <w:proofErr w:type="spellStart"/>
+      <w:r>
+        <w:rPr>
+          <w:lang w:val="fr-FR"/>
+        </w:rPr>
+        <w:t>lacus</w:t>
+      </w:r>
+      <w:proofErr w:type="spellEnd"/>
+      <w:r>
+        <w:rPr>
+          <w:lang w:val="fr-FR"/>
+        </w:rPr>
+        <w:t xml:space="preserve">. </w:t>
+      </w:r>
+      <w:proofErr w:type="spellStart"/>
+      <w:r>
+        <w:rPr>
+          <w:lang w:val="fr-FR"/>
+        </w:rPr>
+        <w:t>Aliquam</w:t>
+      </w:r>
+      <w:proofErr w:type="spellEnd"/>
+      <w:r>
+        <w:rPr>
+          <w:lang w:val="fr-FR"/>
+        </w:rPr>
+        <w:t xml:space="preserve"> erat </w:t>
+      </w:r>
+      <w:proofErr w:type="spellStart"/>
+      <w:r>
+        <w:rPr>
+          <w:lang w:val="fr-FR"/>
+        </w:rPr>
+        <w:t>volutpat</w:t>
+      </w:r>
+      <w:proofErr w:type="spellEnd"/>
+      <w:r>
+        <w:rPr>
+          <w:lang w:val="fr-FR"/>
+        </w:rPr>
+        <w:t xml:space="preserve">. </w:t>
+      </w:r>
+      <w:proofErr w:type="spellStart"/>
+      <w:r>
+        <w:rPr>
+          <w:lang w:val="fr-FR"/>
+        </w:rPr>
+        <w:t>Vivamus</w:t>
+      </w:r>
+      <w:proofErr w:type="spellEnd"/>
+      <w:r>
+        <w:rPr>
+          <w:lang w:val="fr-FR"/>
+        </w:rPr>
+        <w:t xml:space="preserve"> magna </w:t>
+      </w:r>
+      <w:proofErr w:type="spellStart"/>
+      <w:r>
+        <w:rPr>
+          <w:lang w:val="fr-FR"/>
+        </w:rPr>
+        <w:t>turpis</w:t>
+      </w:r>
+      <w:proofErr w:type="spellEnd"/>
+      <w:r>
+        <w:rPr>
+          <w:lang w:val="fr-FR"/>
+        </w:rPr>
+        <w:t xml:space="preserve">, </w:t>
+      </w:r>
+      <w:proofErr w:type="spellStart"/>
+      <w:r>
+        <w:rPr>
+          <w:lang w:val="fr-FR"/>
+        </w:rPr>
+        <w:t>maximus</w:t>
+      </w:r>
+      <w:proofErr w:type="spellEnd"/>
+      <w:r>
+        <w:rPr>
+          <w:lang w:val="fr-FR"/>
+        </w:rPr>
+        <w:t xml:space="preserve"> in </w:t>
+      </w:r>
+      <w:proofErr w:type="spellStart"/>
+      <w:r>
+        <w:rPr>
+          <w:lang w:val="fr-FR"/>
+        </w:rPr>
+        <w:t>neque</w:t>
+      </w:r>
+      <w:proofErr w:type="spellEnd"/>
+      <w:r>
+        <w:rPr>
+          <w:lang w:val="fr-FR"/>
+        </w:rPr>
+        <w:t xml:space="preserve"> </w:t>
+      </w:r>
+      <w:proofErr w:type="spellStart"/>
+      <w:r>
+        <w:rPr>
+          <w:lang w:val="fr-FR"/>
+        </w:rPr>
+        <w:t>rutrum</w:t>
+      </w:r>
+      <w:proofErr w:type="spellEnd"/>
+      <w:r>
+        <w:rPr>
+          <w:lang w:val="fr-FR"/>
+        </w:rPr>
+        <w:t xml:space="preserve">, dictum </w:t>
+      </w:r>
+      <w:proofErr w:type="spellStart"/>
+      <w:r>
+        <w:rPr>
+          <w:lang w:val="fr-FR"/>
+        </w:rPr>
+        <w:t>blandit</w:t>
+      </w:r>
+      <w:proofErr w:type="spellEnd"/>
+      <w:r>
+        <w:rPr>
+          <w:lang w:val="fr-FR"/>
+        </w:rPr>
+        <w:t xml:space="preserve"> </w:t>
+      </w:r>
+      <w:proofErr w:type="spellStart"/>
+      <w:r>
+        <w:rPr>
+          <w:lang w:val="fr-FR"/>
+        </w:rPr>
+        <w:t>leo</w:t>
+      </w:r>
+      <w:proofErr w:type="spellEnd"/>
+      <w:r>
+        <w:rPr>
+          <w:lang w:val="fr-FR"/>
+        </w:rPr>
+        <w:t xml:space="preserve">. Morbi </w:t>
+      </w:r>
+      <w:proofErr w:type="spellStart"/>
+      <w:r>
+        <w:rPr>
+          <w:lang w:val="fr-FR"/>
+        </w:rPr>
+        <w:t>vehicula</w:t>
+      </w:r>
+      <w:proofErr w:type="spellEnd"/>
+      <w:r>
+        <w:rPr>
+          <w:lang w:val="fr-FR"/>
+        </w:rPr>
+        <w:t xml:space="preserve"> </w:t>
+      </w:r>
+      <w:proofErr w:type="spellStart"/>
+      <w:r>
+        <w:rPr>
+          <w:lang w:val="fr-FR"/>
+        </w:rPr>
+        <w:t>congue</w:t>
+      </w:r>
+      <w:proofErr w:type="spellEnd"/>
+      <w:r>
+        <w:rPr>
+          <w:lang w:val="fr-FR"/>
+        </w:rPr>
+        <w:t xml:space="preserve"> </w:t>
+      </w:r>
+      <w:proofErr w:type="spellStart"/>
+      <w:r>
+        <w:rPr>
+          <w:lang w:val="fr-FR"/>
+        </w:rPr>
+        <w:t>nulla</w:t>
+      </w:r>
+      <w:proofErr w:type="spellEnd"/>
+      <w:r>
+        <w:rPr>
+          <w:lang w:val="fr-FR"/>
+        </w:rPr>
+        <w:t xml:space="preserve">, </w:t>
+      </w:r>
+      <w:proofErr w:type="spellStart"/>
+      <w:r>
+        <w:rPr>
+          <w:lang w:val="fr-FR"/>
+        </w:rPr>
+        <w:t>quis</w:t>
+      </w:r>
+      <w:proofErr w:type="spellEnd"/>
+      <w:r>
+        <w:rPr>
+          <w:lang w:val="fr-FR"/>
+        </w:rPr>
+        <w:t xml:space="preserve"> </w:t>
+      </w:r>
+      <w:proofErr w:type="spellStart"/>
+      <w:r>
+        <w:rPr>
+          <w:lang w:val="fr-FR"/>
+        </w:rPr>
+        <w:t>ullamcorper</w:t>
+      </w:r>
+      <w:proofErr w:type="spellEnd"/>
+      <w:r>
+        <w:rPr>
+          <w:lang w:val="fr-FR"/>
+        </w:rPr>
+        <w:t xml:space="preserve"> </w:t>
+      </w:r>
+      <w:proofErr w:type="spellStart"/>
+      <w:r>
+        <w:rPr>
+          <w:lang w:val="fr-FR"/>
+        </w:rPr>
+        <w:t>tellus</w:t>
+      </w:r>
+      <w:proofErr w:type="spellEnd"/>
+      <w:r>
+        <w:rPr>
+          <w:lang w:val="fr-FR"/>
+        </w:rPr>
+        <w:t xml:space="preserve"> </w:t>
+      </w:r>
+      <w:proofErr w:type="spellStart"/>
+      <w:r>
+        <w:rPr>
+          <w:lang w:val="fr-FR"/>
+        </w:rPr>
+        <w:t>finibus</w:t>
+      </w:r>
+      <w:proofErr w:type="spellEnd"/>
+      <w:r>
+        <w:rPr>
+          <w:lang w:val="fr-FR"/>
+        </w:rPr>
+        <w:t xml:space="preserve"> mollis. </w:t>
+      </w:r>
+      <w:r>
+        <w:rPr>
+          <w:lang w:val="fr-FR"/>
+        </w:rPr>
+        <w:t xml:space="preserve">Sed id </w:t>
+      </w:r>
+      <w:proofErr w:type="spellStart"/>
+      <w:r>
+        <w:rPr>
+          <w:lang w:val="fr-FR"/>
+        </w:rPr>
+        <w:t>mauris</w:t>
+      </w:r>
+      <w:proofErr w:type="spellEnd"/>
+      <w:r>
+        <w:rPr>
+          <w:lang w:val="fr-FR"/>
+        </w:rPr>
+        <w:t xml:space="preserve"> at </w:t>
+      </w:r>
+      <w:proofErr w:type="spellStart"/>
+      <w:r>
+        <w:rPr>
+          <w:lang w:val="fr-FR"/>
+        </w:rPr>
+        <w:t>purus</w:t>
+      </w:r>
+      <w:proofErr w:type="spellEnd"/>
+      <w:r>
+        <w:rPr>
+          <w:lang w:val="fr-FR"/>
+        </w:rPr>
+        <w:t xml:space="preserve"> </w:t>
+      </w:r>
+      <w:proofErr w:type="spellStart"/>
+      <w:r>
+        <w:rPr>
+          <w:lang w:val="fr-FR"/>
+        </w:rPr>
+        <w:t>efficitur</w:t>
+      </w:r>
+      <w:proofErr w:type="spellEnd"/>
+      <w:r>
+        <w:rPr>
+          <w:lang w:val="fr-FR"/>
+        </w:rPr>
+        <w:t xml:space="preserve"> </w:t>
+      </w:r>
+      <w:proofErr w:type="spellStart"/>
+      <w:r>
+        <w:rPr>
+          <w:lang w:val="fr-FR"/>
+        </w:rPr>
+        <w:t>vulputate</w:t>
+      </w:r>
+      <w:proofErr w:type="spellEnd"/>
+      <w:r>
+        <w:rPr>
+          <w:lang w:val="fr-FR"/>
+        </w:rPr>
+        <w:t xml:space="preserve"> vitae a </w:t>
+      </w:r>
+      <w:proofErr w:type="spellStart"/>
+      <w:r>
+        <w:rPr>
+          <w:lang w:val="fr-FR"/>
+        </w:rPr>
+        <w:t>sapien</w:t>
+      </w:r>
+      <w:proofErr w:type="spellEnd"/>
+      <w:r>
+        <w:rPr>
+          <w:lang w:val="fr-FR"/>
+        </w:rPr>
+        <w:t>.</w:t>
+      </w:r>
+      <w:r>
+        <w:rPr>
+          <w:lang w:val="fr-FR"/>
+        </w:rPr>
+        <w:t xml:space="preserve"> </w:t>
+      </w:r>
+      <w:r>
+        <w:rPr>
+          <w:rStyle w:val="VerbatimChar"/>
+        </w:rPr>
+        <w:t>Verbatim Char</w:t>
+      </w:r>
     </w:p>
     <w:p>
       <w:pPr>
@@ -10019,6 +10007,15 @@
       <w:shd w:val="clear" w:color="auto" w:fill="E1DFDD"/>
     </w:rPr>
   </w:style>
+  <w:style w:type="character" w:customStyle="1" w:styleId="VerbatimChar">
+    <w:name w:val="Verbatim Char"/>
+    <w:basedOn w:val="DefaultParagraphFont"/>
+    <w:rsid w:val="00B06606"/>
+    <w:rPr>
+      <w:rFonts w:ascii="Consolas" w:hAnsi="Consolas"/>
+      <w:sz w:val="22"/>
+    </w:rPr>
+  </w:style>
 </w:styles>
 </file>
 

</xml_diff>